<commit_message>
Criacao da ponto tratado por dia e alteracao do resumo da folha para se tornar apenas uma linha de cada funcionario. criacao procedure que inclui funcionario
</commit_message>
<xml_diff>
--- a/Diario_Dev.docx
+++ b/Diario_Dev.docx
@@ -1846,6 +1846,525 @@
     <w:p>
       <w:pPr>
         <w:ind w:firstLine="708"/>
+        <w:jc w:val="center"/>
+        <w:rPr>
+          <w:b/>
+          <w:bCs/>
+          <w:sz w:val="32"/>
+          <w:szCs w:val="32"/>
+        </w:rPr>
+      </w:pPr>
+      <w:r>
+        <w:rPr>
+          <w:b/>
+          <w:bCs/>
+          <w:sz w:val="32"/>
+          <w:szCs w:val="32"/>
+        </w:rPr>
+        <w:t xml:space="preserve">Dia </w:t>
+      </w:r>
+      <w:r>
+        <w:rPr>
+          <w:b/>
+          <w:bCs/>
+          <w:sz w:val="32"/>
+          <w:szCs w:val="32"/>
+        </w:rPr>
+        <w:t>6</w:t>
+      </w:r>
+      <w:r>
+        <w:rPr>
+          <w:b/>
+          <w:bCs/>
+          <w:sz w:val="32"/>
+          <w:szCs w:val="32"/>
+        </w:rPr>
+        <w:t xml:space="preserve"> (</w:t>
+      </w:r>
+      <w:r>
+        <w:rPr>
+          <w:b/>
+          <w:bCs/>
+          <w:sz w:val="32"/>
+          <w:szCs w:val="32"/>
+        </w:rPr>
+        <w:t>23</w:t>
+      </w:r>
+      <w:r>
+        <w:rPr>
+          <w:b/>
+          <w:bCs/>
+          <w:sz w:val="32"/>
+          <w:szCs w:val="32"/>
+        </w:rPr>
+        <w:t>/02/2026)</w:t>
+      </w:r>
+    </w:p>
+    <w:p>
+      <w:pPr>
+        <w:ind w:firstLine="708"/>
+        <w:jc w:val="both"/>
+      </w:pPr>
+      <w:r>
+        <w:t>Não consegui fazer muita coisa hoje, a cabeça estava meio travada, queria criar uma tabela pra guardar e os eventos do ponto como faltas, horas extras e atrasos mas não estava sabendo como, o chatgpt tinha me sugerido uma tabela intermediária mas não compreendi muito bem.</w:t>
+      </w:r>
+    </w:p>
+    <w:p>
+      <w:pPr>
+        <w:ind w:firstLine="708"/>
+        <w:jc w:val="both"/>
+      </w:pPr>
+      <w:r>
+        <w:t>Resolvi focar só na criação da tabela de eventos e na de encargos e pensando como farei na procedure pra incluir eles na tabela de encargos mas já sei mais ou menos, preciso só testar.</w:t>
+      </w:r>
+    </w:p>
+    <w:p>
+      <w:pPr>
+        <w:ind w:firstLine="708"/>
+        <w:jc w:val="both"/>
+      </w:pPr>
+    </w:p>
+    <w:p>
+      <w:pPr>
+        <w:ind w:firstLine="708"/>
+        <w:jc w:val="center"/>
+        <w:rPr>
+          <w:b/>
+          <w:bCs/>
+          <w:sz w:val="32"/>
+          <w:szCs w:val="32"/>
+        </w:rPr>
+      </w:pPr>
+      <w:r>
+        <w:rPr>
+          <w:b/>
+          <w:bCs/>
+          <w:sz w:val="32"/>
+          <w:szCs w:val="32"/>
+        </w:rPr>
+        <w:t xml:space="preserve">Dia </w:t>
+      </w:r>
+      <w:r>
+        <w:rPr>
+          <w:b/>
+          <w:bCs/>
+          <w:sz w:val="32"/>
+          <w:szCs w:val="32"/>
+        </w:rPr>
+        <w:t>7</w:t>
+      </w:r>
+      <w:r>
+        <w:rPr>
+          <w:b/>
+          <w:bCs/>
+          <w:sz w:val="32"/>
+          <w:szCs w:val="32"/>
+        </w:rPr>
+        <w:t xml:space="preserve"> (</w:t>
+      </w:r>
+      <w:r>
+        <w:rPr>
+          <w:b/>
+          <w:bCs/>
+          <w:sz w:val="32"/>
+          <w:szCs w:val="32"/>
+        </w:rPr>
+        <w:t>24</w:t>
+      </w:r>
+      <w:r>
+        <w:rPr>
+          <w:b/>
+          <w:bCs/>
+          <w:sz w:val="32"/>
+          <w:szCs w:val="32"/>
+        </w:rPr>
+        <w:t>/02/2026)</w:t>
+      </w:r>
+    </w:p>
+    <w:p>
+      <w:pPr>
+        <w:ind w:firstLine="708"/>
+      </w:pPr>
+      <w:r>
+        <w:t>Passei a noite pensando em como fazer a tabela para os eventos de ponto e acho que consegui compreender a lógica, hoje vou por em prática para ver se consigo fazer funcionar</w:t>
+      </w:r>
+    </w:p>
+    <w:p>
+      <w:pPr>
+        <w:ind w:firstLine="708"/>
+      </w:pPr>
+    </w:p>
+    <w:p>
+      <w:pPr>
+        <w:ind w:firstLine="708"/>
+        <w:jc w:val="center"/>
+        <w:rPr>
+          <w:b/>
+          <w:bCs/>
+          <w:sz w:val="32"/>
+          <w:szCs w:val="32"/>
+        </w:rPr>
+      </w:pPr>
+    </w:p>
+    <w:p>
+      <w:pPr>
+        <w:ind w:firstLine="708"/>
+        <w:jc w:val="center"/>
+        <w:rPr>
+          <w:b/>
+          <w:bCs/>
+          <w:sz w:val="32"/>
+          <w:szCs w:val="32"/>
+        </w:rPr>
+      </w:pPr>
+      <w:r>
+        <w:rPr>
+          <w:b/>
+          <w:bCs/>
+          <w:sz w:val="32"/>
+          <w:szCs w:val="32"/>
+        </w:rPr>
+        <w:lastRenderedPageBreak/>
+        <w:t xml:space="preserve">Dia </w:t>
+      </w:r>
+      <w:r>
+        <w:rPr>
+          <w:b/>
+          <w:bCs/>
+          <w:sz w:val="32"/>
+          <w:szCs w:val="32"/>
+        </w:rPr>
+        <w:t>8</w:t>
+      </w:r>
+      <w:r>
+        <w:rPr>
+          <w:b/>
+          <w:bCs/>
+          <w:sz w:val="32"/>
+          <w:szCs w:val="32"/>
+        </w:rPr>
+        <w:t xml:space="preserve"> (</w:t>
+      </w:r>
+      <w:r>
+        <w:rPr>
+          <w:b/>
+          <w:bCs/>
+          <w:sz w:val="32"/>
+          <w:szCs w:val="32"/>
+        </w:rPr>
+        <w:t>25</w:t>
+      </w:r>
+      <w:r>
+        <w:rPr>
+          <w:b/>
+          <w:bCs/>
+          <w:sz w:val="32"/>
+          <w:szCs w:val="32"/>
+        </w:rPr>
+        <w:t>/02/2026)</w:t>
+      </w:r>
+    </w:p>
+    <w:p>
+      <w:pPr>
+        <w:ind w:firstLine="708"/>
+      </w:pPr>
+      <w:r>
+        <w:t>Poxa hoje não consegui fazer muita coisa, passei o tempo todo mais pensando em como faria a tabela de ponto. Depois de pensar muito cheguei a conclusão que acho que seria interessante eu ter 3  “camadas”, fazer uma tabela para o ponto por dia, uma do resumo mensal e uma pra guardar os cálculos para que fique um histórico mas não saí muito da parte teórica, consegui só criar as tabelas de resumo_ponto e fechamento_ponto, a do ponto diário vou deixar pra último e pra depois, acho que fazer essa “engenharia reversa” talvez funcione melhor, pelo menos na minha cabeça.</w:t>
+      </w:r>
+    </w:p>
+    <w:p>
+      <w:pPr>
+        <w:ind w:firstLine="708"/>
+      </w:pPr>
+    </w:p>
+    <w:p>
+      <w:pPr>
+        <w:ind w:firstLine="708"/>
+        <w:jc w:val="center"/>
+        <w:rPr>
+          <w:b/>
+          <w:bCs/>
+          <w:sz w:val="32"/>
+          <w:szCs w:val="32"/>
+        </w:rPr>
+      </w:pPr>
+      <w:r>
+        <w:rPr>
+          <w:b/>
+          <w:bCs/>
+          <w:sz w:val="32"/>
+          <w:szCs w:val="32"/>
+        </w:rPr>
+        <w:t xml:space="preserve">Dia </w:t>
+      </w:r>
+      <w:r>
+        <w:rPr>
+          <w:b/>
+          <w:bCs/>
+          <w:sz w:val="32"/>
+          <w:szCs w:val="32"/>
+        </w:rPr>
+        <w:t>9</w:t>
+      </w:r>
+      <w:r>
+        <w:rPr>
+          <w:b/>
+          <w:bCs/>
+          <w:sz w:val="32"/>
+          <w:szCs w:val="32"/>
+        </w:rPr>
+        <w:t xml:space="preserve"> (</w:t>
+      </w:r>
+      <w:r>
+        <w:rPr>
+          <w:b/>
+          <w:bCs/>
+          <w:sz w:val="32"/>
+          <w:szCs w:val="32"/>
+        </w:rPr>
+        <w:t>26</w:t>
+      </w:r>
+      <w:r>
+        <w:rPr>
+          <w:b/>
+          <w:bCs/>
+          <w:sz w:val="32"/>
+          <w:szCs w:val="32"/>
+        </w:rPr>
+        <w:t>/02/2026)</w:t>
+      </w:r>
+    </w:p>
+    <w:p>
+      <w:pPr>
+        <w:ind w:firstLine="708"/>
+      </w:pPr>
+      <w:r>
+        <w:t>Depois de dormir pensando em como faria a inclusão na tabela de fechamento de ponto consegui entender a lógica, chatgpt me ajudou a entender como usar uma procedure para fazer o cálculo de todos de uma vez, pensava que seria só através do cursor mas vi que dá pra fazer através de um INSERT SELECT, consegui fazer a procedure para pegar as informações do resumo_ponto e jogar na fechamento_ponto já com os devidos cálculo para hora extra 100% e 50%, falta incluir a inteligência para calcular as faltas ainda mas já sei como fazer, pensando agora que tenho que alterar a procedure que usa cursor para fazer o cálculo da folha para criar um INSERT SELECT também, acho que dará um bom trabalho mas nada complexo.</w:t>
+      </w:r>
+    </w:p>
+    <w:p>
+      <w:pPr>
+        <w:ind w:firstLine="708"/>
+      </w:pPr>
+    </w:p>
+    <w:p>
+      <w:pPr>
+        <w:ind w:firstLine="708"/>
+        <w:jc w:val="center"/>
+        <w:rPr>
+          <w:b/>
+          <w:bCs/>
+          <w:sz w:val="32"/>
+          <w:szCs w:val="32"/>
+        </w:rPr>
+      </w:pPr>
+      <w:r>
+        <w:rPr>
+          <w:b/>
+          <w:bCs/>
+          <w:sz w:val="32"/>
+          <w:szCs w:val="32"/>
+        </w:rPr>
+        <w:t xml:space="preserve">Dia </w:t>
+      </w:r>
+      <w:r>
+        <w:rPr>
+          <w:b/>
+          <w:bCs/>
+          <w:sz w:val="32"/>
+          <w:szCs w:val="32"/>
+        </w:rPr>
+        <w:t>10</w:t>
+      </w:r>
+      <w:r>
+        <w:rPr>
+          <w:b/>
+          <w:bCs/>
+          <w:sz w:val="32"/>
+          <w:szCs w:val="32"/>
+        </w:rPr>
+        <w:t xml:space="preserve"> (</w:t>
+      </w:r>
+      <w:r>
+        <w:rPr>
+          <w:b/>
+          <w:bCs/>
+          <w:sz w:val="32"/>
+          <w:szCs w:val="32"/>
+        </w:rPr>
+        <w:t>28</w:t>
+      </w:r>
+      <w:r>
+        <w:rPr>
+          <w:b/>
+          <w:bCs/>
+          <w:sz w:val="32"/>
+          <w:szCs w:val="32"/>
+        </w:rPr>
+        <w:t>/02/2026)</w:t>
+      </w:r>
+    </w:p>
+    <w:p>
+      <w:pPr>
+        <w:ind w:firstLine="708"/>
+      </w:pPr>
+      <w:r>
+        <w:t>Dia de muito trabalho, simbora!</w:t>
+      </w:r>
+      <w:r>
+        <w:t xml:space="preserve"> Al Green na caixa e vamos</w:t>
+      </w:r>
+      <w:r>
+        <w:t>.</w:t>
+      </w:r>
+    </w:p>
+    <w:p>
+      <w:pPr>
+        <w:ind w:firstLine="708"/>
+      </w:pPr>
+      <w:r>
+        <w:t xml:space="preserve">No modelo atual o funcionário não tem como ter dois benefícios, exemplo, gratificação e insalubridade juntos, pensei que podia fazer tipo beneficio1, beneficio2, beneficio3, mas não me parecia muito adequado, pensei em separa insalubridade e periculosidade das gratificações e de outros benefícios criando 3 tabelas, até que meu consultor GPT me explicou que nesses casos </w:t>
+      </w:r>
+      <w:r>
+        <w:t>o ideal seria uma tabela intermediária, fujo delas, não sei se é um pouco de preguiça ou não entender bem mas FINALMENTE depois de muitos cursos já estudando sobre isso  com o GPT consegui entender de vez como funciona, em que ocasiões usar, o que sempre via de relacionamento N:N entendia mas não compreendia a fundo e agora tudo faz sentido. Vou desenvolver agoraaaa!!</w:t>
+      </w:r>
+      <w:r>
+        <w:t xml:space="preserve"> </w:t>
+      </w:r>
+    </w:p>
+    <w:p>
+      <w:pPr>
+        <w:ind w:firstLine="708"/>
+      </w:pPr>
+    </w:p>
+    <w:p>
+      <w:pPr>
+        <w:ind w:firstLine="708"/>
+        <w:jc w:val="center"/>
+        <w:rPr>
+          <w:b/>
+          <w:bCs/>
+        </w:rPr>
+      </w:pPr>
+      <w:r>
+        <w:rPr>
+          <w:b/>
+          <w:bCs/>
+        </w:rPr>
+        <w:lastRenderedPageBreak/>
+        <w:t>DIA 11 (07/03/2026)</w:t>
+      </w:r>
+    </w:p>
+    <w:p>
+      <w:pPr>
+        <w:ind w:firstLine="708"/>
+      </w:pPr>
+      <w:r>
+        <w:t>Muitos dias parados, tristeeeeee. Mas não deixo de pensar um dia no projeto e estive parado não por preguiça ou algo do tipo mas tinha travado, não sabia como sair de onde estava e não queria perguntar direto pro chatgpt, tenho evitado ao máximo, uso só para rever minhas coisas e sugerir boas práticas, mas depois de muitos dias pensando confesso que não consegui encontrar até que tive que recorrer ao gpt e a solução era incrivelmente simples, que raiva. Mas serviu para aprender mais um conceito do INSERT SELECT que eu estou usando e foi bem importante que era básico, a importância da estrutura dele.</w:t>
+      </w:r>
+      <w:r>
+        <w:t xml:space="preserve"> Agora voltou a andar e bastante, Glóriaaaa. Outra coisa que acabou de girar mais uma chave na cabeça aqui a SUBQUERY, tá doido, é importante demais, uma coisa que não tava conseguindo evoluir era ter um código do cálculo de folha com todos os cálculos amontoados, agora deixo os cálculo na subquery e uso os Alias no cálculo principal o que tem facilitado demais meu entendimento do todo, estava me perdendo muito no </w:t>
+      </w:r>
+      <w:r>
+        <w:t xml:space="preserve">código. Consegui incluir o cálculo das horas extras na folha, ajustar os encargos pelo menos parcialmente, ainda preciso fazer via tabela </w:t>
+      </w:r>
+    </w:p>
+    <w:p>
+      <w:pPr>
+        <w:ind w:firstLine="708"/>
+      </w:pPr>
+    </w:p>
+    <w:p>
+      <w:pPr>
+        <w:ind w:firstLine="708"/>
+        <w:jc w:val="center"/>
+        <w:rPr>
+          <w:b/>
+          <w:bCs/>
+        </w:rPr>
+      </w:pPr>
+      <w:r>
+        <w:rPr>
+          <w:b/>
+          <w:bCs/>
+        </w:rPr>
+        <w:t>DIA 1</w:t>
+      </w:r>
+      <w:r>
+        <w:rPr>
+          <w:b/>
+          <w:bCs/>
+        </w:rPr>
+        <w:t xml:space="preserve">2 </w:t>
+      </w:r>
+      <w:r>
+        <w:rPr>
+          <w:b/>
+          <w:bCs/>
+        </w:rPr>
+        <w:t>(</w:t>
+      </w:r>
+      <w:r>
+        <w:rPr>
+          <w:b/>
+          <w:bCs/>
+        </w:rPr>
+        <w:t>11</w:t>
+      </w:r>
+      <w:r>
+        <w:rPr>
+          <w:b/>
+          <w:bCs/>
+        </w:rPr>
+        <w:t>/03/2026)</w:t>
+      </w:r>
+    </w:p>
+    <w:p>
+      <w:pPr>
+        <w:ind w:firstLine="708"/>
+      </w:pPr>
+      <w:r>
+        <w:t>Voltei pro projeto, estava meio parado pensando no modelo, e  hoje vim aplicar umas mudanças, fiz uma procedure pra cadastrar um funcionário pra testar se ainda lembro a lógica da procedure e deu certinho, como disse anteriormente acho que agora não esqueço mais, entendi a estrutura dela certinho. Alterei a tabela de fechamento de ponto, na realidade não sei se a melhor prática era como estava antes mas agora resumi em uma linha pra cada funcionário, antes era uma linha pro resumo do funcionário e evento, achei mais compacto e fiz uma nova procedure também pra adaptar a nova tabela, está funcionando perfeitamente</w:t>
+      </w:r>
+    </w:p>
+    <w:p>
+      <w:pPr>
+        <w:ind w:firstLine="708"/>
+      </w:pPr>
+      <w:r>
+        <w:t>- SubQuery da folha</w:t>
+      </w:r>
+    </w:p>
+    <w:p>
+      <w:pPr>
+        <w:ind w:firstLine="708"/>
+      </w:pPr>
+    </w:p>
+    <w:p>
+      <w:pPr>
+        <w:ind w:firstLine="708"/>
+      </w:pPr>
+    </w:p>
+    <w:p>
+      <w:pPr>
+        <w:ind w:firstLine="708"/>
+      </w:pPr>
+    </w:p>
+    <w:p>
+      <w:pPr>
+        <w:ind w:firstLine="708"/>
+        <w:jc w:val="both"/>
+      </w:pPr>
+    </w:p>
+    <w:p>
+      <w:pPr>
+        <w:ind w:firstLine="708"/>
+        <w:jc w:val="both"/>
+      </w:pPr>
+    </w:p>
+    <w:p>
+      <w:pPr>
+        <w:ind w:firstLine="708"/>
         <w:jc w:val="both"/>
       </w:pPr>
     </w:p>
@@ -1980,118 +2499,168 @@
         <w:jc w:val="both"/>
       </w:pPr>
       <w:r>
+        <w:t>select c.nome as Cargo, round(avg(salario),2) as 'Média Salarial', count(id_funcionario) as 'Total Funcionários' from funcionarios f</w:t>
+      </w:r>
+    </w:p>
+    <w:p>
+      <w:pPr>
+        <w:ind w:firstLine="708"/>
+        <w:jc w:val="both"/>
+      </w:pPr>
+      <w:r>
+        <w:t>join cargos c on c.id_cargo = f.id_cargo</w:t>
+      </w:r>
+    </w:p>
+    <w:p>
+      <w:pPr>
+        <w:ind w:firstLine="708"/>
+        <w:jc w:val="both"/>
+      </w:pPr>
+      <w:r>
+        <w:t>group by c.nome</w:t>
+      </w:r>
+    </w:p>
+    <w:p>
+      <w:pPr>
+        <w:ind w:firstLine="708"/>
+        <w:jc w:val="both"/>
+      </w:pPr>
+      <w:r>
+        <w:t>order by c.nome;</w:t>
+      </w:r>
+    </w:p>
+    <w:p>
+      <w:pPr>
+        <w:ind w:firstLine="708"/>
+        <w:jc w:val="both"/>
+      </w:pPr>
+    </w:p>
+    <w:p>
+      <w:pPr>
+        <w:ind w:firstLine="708"/>
+        <w:jc w:val="both"/>
+        <w:rPr>
+          <w:b/>
+          <w:bCs/>
+        </w:rPr>
+      </w:pPr>
+      <w:r>
+        <w:rPr>
+          <w:b/>
+          <w:bCs/>
+        </w:rPr>
+        <w:t>-- Média por tipo de despesa (Direta ou Indireta) e contagem de funcionários</w:t>
+      </w:r>
+    </w:p>
+    <w:p>
+      <w:pPr>
+        <w:ind w:firstLine="708"/>
+        <w:jc w:val="both"/>
+      </w:pPr>
+      <w:r>
+        <w:t>select d.despesa, round(avg(salario),2) as 'Média Salarial', count(id_funcionario) as 'Total Funcionários' from funcionarios f</w:t>
+      </w:r>
+    </w:p>
+    <w:p>
+      <w:pPr>
+        <w:ind w:firstLine="708"/>
+        <w:jc w:val="both"/>
+      </w:pPr>
+      <w:r>
+        <w:t>join departamentos d on d.id_departamento = f.id_departamento</w:t>
+      </w:r>
+    </w:p>
+    <w:p>
+      <w:pPr>
+        <w:ind w:firstLine="708"/>
+        <w:jc w:val="both"/>
+      </w:pPr>
+      <w:r>
+        <w:t>group by d.despesa;</w:t>
+      </w:r>
+    </w:p>
+    <w:p>
+      <w:pPr>
+        <w:ind w:firstLine="708"/>
+        <w:jc w:val="both"/>
+      </w:pPr>
+    </w:p>
+    <w:p>
+      <w:pPr>
+        <w:ind w:firstLine="708"/>
+        <w:jc w:val="both"/>
+        <w:rPr>
+          <w:b/>
+          <w:bCs/>
+        </w:rPr>
+      </w:pPr>
+      <w:r>
+        <w:rPr>
+          <w:b/>
+          <w:bCs/>
+        </w:rPr>
+        <w:t>-- ANÁLISES POR SEXO</w:t>
+      </w:r>
+    </w:p>
+    <w:p>
+      <w:pPr>
+        <w:ind w:firstLine="708"/>
+        <w:jc w:val="both"/>
+        <w:rPr>
+          <w:b/>
+          <w:bCs/>
+        </w:rPr>
+      </w:pPr>
+    </w:p>
+    <w:p>
+      <w:pPr>
+        <w:ind w:firstLine="708"/>
+        <w:jc w:val="both"/>
+        <w:rPr>
+          <w:b/>
+          <w:bCs/>
+        </w:rPr>
+      </w:pPr>
+      <w:r>
+        <w:rPr>
+          <w:b/>
+          <w:bCs/>
+        </w:rPr>
+        <w:t>-- Contagem de homens e mulheres</w:t>
+      </w:r>
+    </w:p>
+    <w:p>
+      <w:pPr>
+        <w:ind w:firstLine="708"/>
+        <w:jc w:val="both"/>
+      </w:pPr>
+      <w:r>
+        <w:t>select f.sexo, count(sexo)</w:t>
+      </w:r>
+    </w:p>
+    <w:p>
+      <w:pPr>
+        <w:ind w:firstLine="708"/>
+        <w:jc w:val="both"/>
+      </w:pPr>
+      <w:r>
         <w:lastRenderedPageBreak/>
-        <w:t>select c.nome as Cargo, round(avg(salario),2) as 'Média Salarial', count(id_funcionario) as 'Total Funcionários' from funcionarios f</w:t>
-      </w:r>
-    </w:p>
-    <w:p>
-      <w:pPr>
-        <w:ind w:firstLine="708"/>
-        <w:jc w:val="both"/>
-      </w:pPr>
-      <w:r>
-        <w:t>join cargos c on c.id_cargo = f.id_cargo</w:t>
-      </w:r>
-    </w:p>
-    <w:p>
-      <w:pPr>
-        <w:ind w:firstLine="708"/>
-        <w:jc w:val="both"/>
-      </w:pPr>
-      <w:r>
-        <w:t>group by c.nome</w:t>
-      </w:r>
-    </w:p>
-    <w:p>
-      <w:pPr>
-        <w:ind w:firstLine="708"/>
-        <w:jc w:val="both"/>
-      </w:pPr>
-      <w:r>
-        <w:t>order by c.nome;</w:t>
-      </w:r>
-    </w:p>
-    <w:p>
-      <w:pPr>
-        <w:ind w:firstLine="708"/>
-        <w:jc w:val="both"/>
-      </w:pPr>
-    </w:p>
-    <w:p>
-      <w:pPr>
-        <w:ind w:firstLine="708"/>
-        <w:jc w:val="both"/>
-        <w:rPr>
-          <w:b/>
-          <w:bCs/>
-        </w:rPr>
-      </w:pPr>
-      <w:r>
-        <w:rPr>
-          <w:b/>
-          <w:bCs/>
-        </w:rPr>
-        <w:t>-- Média por tipo de despesa (Direta ou Indireta) e contagem de funcionários</w:t>
-      </w:r>
-    </w:p>
-    <w:p>
-      <w:pPr>
-        <w:ind w:firstLine="708"/>
-        <w:jc w:val="both"/>
-      </w:pPr>
-      <w:r>
-        <w:t>select d.despesa, round(avg(salario),2) as 'Média Salarial', count(id_funcionario) as 'Total Funcionários' from funcionarios f</w:t>
-      </w:r>
-    </w:p>
-    <w:p>
-      <w:pPr>
-        <w:ind w:firstLine="708"/>
-        <w:jc w:val="both"/>
-      </w:pPr>
-      <w:r>
-        <w:t>join departamentos d on d.id_departamento = f.id_departamento</w:t>
-      </w:r>
-    </w:p>
-    <w:p>
-      <w:pPr>
-        <w:ind w:firstLine="708"/>
-        <w:jc w:val="both"/>
-      </w:pPr>
-      <w:r>
-        <w:t>group by d.despesa;</w:t>
-      </w:r>
-    </w:p>
-    <w:p>
-      <w:pPr>
-        <w:ind w:firstLine="708"/>
-        <w:jc w:val="both"/>
-      </w:pPr>
-    </w:p>
-    <w:p>
-      <w:pPr>
-        <w:ind w:firstLine="708"/>
-        <w:jc w:val="both"/>
-        <w:rPr>
-          <w:b/>
-          <w:bCs/>
-        </w:rPr>
-      </w:pPr>
-      <w:r>
-        <w:rPr>
-          <w:b/>
-          <w:bCs/>
-        </w:rPr>
-        <w:t>-- ANÁLISES POR SEXO</w:t>
-      </w:r>
-    </w:p>
-    <w:p>
-      <w:pPr>
-        <w:ind w:firstLine="708"/>
-        <w:jc w:val="both"/>
-        <w:rPr>
-          <w:b/>
-          <w:bCs/>
-        </w:rPr>
+        <w:t>from funcionarios f</w:t>
+      </w:r>
+    </w:p>
+    <w:p>
+      <w:pPr>
+        <w:ind w:firstLine="708"/>
+        <w:jc w:val="both"/>
+      </w:pPr>
+      <w:r>
+        <w:t>group by f.sexo;</w:t>
+      </w:r>
+    </w:p>
+    <w:p>
+      <w:pPr>
+        <w:ind w:firstLine="708"/>
+        <w:jc w:val="both"/>
       </w:pPr>
     </w:p>
     <w:p>
@@ -2110,14 +2679,21 @@
         </w:rPr>
         <w:t>-- Contagem de homens e mulheres</w:t>
       </w:r>
-    </w:p>
-    <w:p>
-      <w:pPr>
-        <w:ind w:firstLine="708"/>
-        <w:jc w:val="both"/>
-      </w:pPr>
-      <w:r>
-        <w:t>select f.sexo, count(sexo)</w:t>
+      <w:r>
+        <w:rPr>
+          <w:b/>
+          <w:bCs/>
+        </w:rPr>
+        <w:t xml:space="preserve"> (percentual %)</w:t>
+      </w:r>
+    </w:p>
+    <w:p>
+      <w:pPr>
+        <w:ind w:firstLine="708"/>
+        <w:jc w:val="both"/>
+      </w:pPr>
+      <w:r>
+        <w:t>select f.sexo, count(sexo) as total, concat(round(((select count(sexo) / (select count(*) from funcionarios) * 100)),2),"%") as percentual</w:t>
       </w:r>
     </w:p>
     <w:p>
@@ -2158,23 +2734,16 @@
           <w:b/>
           <w:bCs/>
         </w:rPr>
-        <w:t>-- Contagem de homens e mulheres</w:t>
-      </w:r>
-      <w:r>
-        <w:rPr>
-          <w:b/>
-          <w:bCs/>
-        </w:rPr>
-        <w:t xml:space="preserve"> (percentual %)</w:t>
-      </w:r>
-    </w:p>
-    <w:p>
-      <w:pPr>
-        <w:ind w:firstLine="708"/>
-        <w:jc w:val="both"/>
-      </w:pPr>
-      <w:r>
-        <w:t>select f.sexo, count(sexo) as total, concat(round(((select count(sexo) / (select count(*) from funcionarios) * 100)),2),"%") as percentual</w:t>
+        <w:t>-- Contagem de homens e mulheres por Departamento</w:t>
+      </w:r>
+    </w:p>
+    <w:p>
+      <w:pPr>
+        <w:ind w:firstLine="708"/>
+        <w:jc w:val="both"/>
+      </w:pPr>
+      <w:r>
+        <w:t>select d.nome as departamento, f.sexo, count(sexo)</w:t>
       </w:r>
     </w:p>
     <w:p>
@@ -2192,57 +2761,6 @@
         <w:jc w:val="both"/>
       </w:pPr>
       <w:r>
-        <w:t>group by f.sexo;</w:t>
-      </w:r>
-    </w:p>
-    <w:p>
-      <w:pPr>
-        <w:ind w:firstLine="708"/>
-        <w:jc w:val="both"/>
-      </w:pPr>
-    </w:p>
-    <w:p>
-      <w:pPr>
-        <w:ind w:firstLine="708"/>
-        <w:jc w:val="both"/>
-        <w:rPr>
-          <w:b/>
-          <w:bCs/>
-        </w:rPr>
-      </w:pPr>
-      <w:r>
-        <w:rPr>
-          <w:b/>
-          <w:bCs/>
-        </w:rPr>
-        <w:t>-- Contagem de homens e mulheres por Departamento</w:t>
-      </w:r>
-    </w:p>
-    <w:p>
-      <w:pPr>
-        <w:ind w:firstLine="708"/>
-        <w:jc w:val="both"/>
-      </w:pPr>
-      <w:r>
-        <w:t>select d.nome as departamento, f.sexo, count(sexo)</w:t>
-      </w:r>
-    </w:p>
-    <w:p>
-      <w:pPr>
-        <w:ind w:firstLine="708"/>
-        <w:jc w:val="both"/>
-      </w:pPr>
-      <w:r>
-        <w:t>from funcionarios f</w:t>
-      </w:r>
-    </w:p>
-    <w:p>
-      <w:pPr>
-        <w:ind w:firstLine="708"/>
-        <w:jc w:val="both"/>
-      </w:pPr>
-      <w:r>
-        <w:lastRenderedPageBreak/>
         <w:t>join departamentos d on d.id_departamento = f.id_departamento</w:t>
       </w:r>
     </w:p>

</xml_diff>

<commit_message>
Ajustes no calculo da folha, criação das procedures para incluir itens nas tabelas (funcionario, cargo, departamento...)
</commit_message>
<xml_diff>
--- a/Diario_Dev.docx
+++ b/Diario_Dev.docx
@@ -2331,36 +2331,170 @@
       <w:pPr>
         <w:ind w:firstLine="708"/>
       </w:pPr>
-      <w:r>
-        <w:t>- SubQuery da folha</w:t>
-      </w:r>
-    </w:p>
-    <w:p>
-      <w:pPr>
-        <w:ind w:firstLine="708"/>
-      </w:pPr>
-    </w:p>
-    <w:p>
-      <w:pPr>
-        <w:ind w:firstLine="708"/>
-      </w:pPr>
-    </w:p>
-    <w:p>
-      <w:pPr>
-        <w:ind w:firstLine="708"/>
-      </w:pPr>
-    </w:p>
-    <w:p>
-      <w:pPr>
-        <w:ind w:firstLine="708"/>
-        <w:jc w:val="both"/>
-      </w:pPr>
-    </w:p>
-    <w:p>
-      <w:pPr>
-        <w:ind w:firstLine="708"/>
-        <w:jc w:val="both"/>
-      </w:pPr>
+    </w:p>
+    <w:p>
+      <w:pPr>
+        <w:ind w:firstLine="708"/>
+        <w:jc w:val="center"/>
+        <w:rPr>
+          <w:b/>
+          <w:bCs/>
+        </w:rPr>
+      </w:pPr>
+      <w:r>
+        <w:rPr>
+          <w:b/>
+          <w:bCs/>
+        </w:rPr>
+        <w:t>DIA 1</w:t>
+      </w:r>
+      <w:r>
+        <w:rPr>
+          <w:b/>
+          <w:bCs/>
+        </w:rPr>
+        <w:t xml:space="preserve">3 </w:t>
+      </w:r>
+      <w:r>
+        <w:rPr>
+          <w:b/>
+          <w:bCs/>
+        </w:rPr>
+        <w:t>(</w:t>
+      </w:r>
+      <w:r>
+        <w:rPr>
+          <w:b/>
+          <w:bCs/>
+        </w:rPr>
+        <w:t>13</w:t>
+      </w:r>
+      <w:r>
+        <w:rPr>
+          <w:b/>
+          <w:bCs/>
+        </w:rPr>
+        <w:t>/0</w:t>
+      </w:r>
+      <w:r>
+        <w:rPr>
+          <w:b/>
+          <w:bCs/>
+        </w:rPr>
+        <w:t>4</w:t>
+      </w:r>
+      <w:r>
+        <w:rPr>
+          <w:b/>
+          <w:bCs/>
+        </w:rPr>
+        <w:t>/2026)</w:t>
+      </w:r>
+    </w:p>
+    <w:p>
+      <w:pPr>
+        <w:ind w:firstLine="708"/>
+      </w:pPr>
+      <w:r>
+        <w:t xml:space="preserve">Agora que reparei mas já estava há mais de um mês sem mexer, estava finalizando a questão de pedir demissão do meu emprego e iniciar no estágio, aparentemente está dando tudo certo, tinha me dado uma última semana para descansar um pouco, foi corrido esses últimos dias. Agora terei a tarde toda pra trabalhar no projeto e hoje no dia de retorno já foi bem produtivo, demorei um pouco pra relembrar certinho onde tinha parado, resolvi encarar uma coisa que estava adiando que era tirar o cadastro do plano de saúde do cadastro de funcionário e criar a tabela intermediário funcionário X plano de saúde, passei o dia todo trabalhando nisso basicamente, das 14:00 as 21:37 horário atual, não sei </w:t>
+      </w:r>
+      <w:r>
+        <w:lastRenderedPageBreak/>
+        <w:t>se foi pouco ou muito tempo mas fiquei feliz que deu tudo certo, tive que ajustar também a tabela de folha de pagamento e ajustar a procedure de cálculo da folha, que foi o que tomou mais tempo que acabei ajustando outras coisinhas também como os NULLS que ainda tinham e ficou uma beleza, calculando tudo certinho sem nenhum “furo” na tabela, com todos as colunas preenchidas. Chat vai me ajudar a melhorar os cálculos que achei muito repetitivo, acho que tenha outra forma de fazer, mas o importante é que está calculando corretamente.</w:t>
+      </w:r>
+    </w:p>
+    <w:p>
+      <w:pPr>
+        <w:ind w:firstLine="708"/>
+      </w:pPr>
+      <w:r>
+        <w:t>E por hoje é só, foi um bom retorno depois de um mês, quero todo dia poder melhorar algo nele, aman</w:t>
+      </w:r>
+      <w:r>
+        <w:t>h</w:t>
+      </w:r>
+      <w:r>
+        <w:t>ã tem mais!!!!</w:t>
+      </w:r>
+    </w:p>
+    <w:p>
+      <w:pPr>
+        <w:ind w:firstLine="708"/>
+      </w:pPr>
+    </w:p>
+    <w:p>
+      <w:pPr>
+        <w:ind w:firstLine="708"/>
+        <w:jc w:val="center"/>
+        <w:rPr>
+          <w:b/>
+          <w:bCs/>
+        </w:rPr>
+      </w:pPr>
+      <w:r>
+        <w:rPr>
+          <w:b/>
+          <w:bCs/>
+        </w:rPr>
+        <w:t>DIA 1</w:t>
+      </w:r>
+      <w:r>
+        <w:rPr>
+          <w:b/>
+          <w:bCs/>
+        </w:rPr>
+        <w:t>4</w:t>
+      </w:r>
+      <w:r>
+        <w:rPr>
+          <w:b/>
+          <w:bCs/>
+        </w:rPr>
+        <w:t xml:space="preserve"> </w:t>
+      </w:r>
+      <w:r>
+        <w:rPr>
+          <w:b/>
+          <w:bCs/>
+        </w:rPr>
+        <w:t>(</w:t>
+      </w:r>
+      <w:r>
+        <w:rPr>
+          <w:b/>
+          <w:bCs/>
+        </w:rPr>
+        <w:t>15</w:t>
+      </w:r>
+      <w:r>
+        <w:rPr>
+          <w:b/>
+          <w:bCs/>
+        </w:rPr>
+        <w:t>/0</w:t>
+      </w:r>
+      <w:r>
+        <w:rPr>
+          <w:b/>
+          <w:bCs/>
+        </w:rPr>
+        <w:t>4</w:t>
+      </w:r>
+      <w:r>
+        <w:rPr>
+          <w:b/>
+          <w:bCs/>
+        </w:rPr>
+        <w:t>/2026)</w:t>
+      </w:r>
+    </w:p>
+    <w:p>
+      <w:pPr>
+        <w:ind w:firstLine="708"/>
+      </w:pPr>
+      <w:r>
+        <w:t>Hoje não estava com muita cabeça pra pensar demais no projeto então foquei em criar as procedures para inclusão de funcionário, departamento, cargo, eventos fixos e de ponto e as demais tabelas que podem ter itens inclusos. Fiquei feliz, consegui fazer todas (apesar de serem basicamente iguais) mas acho importante sempre treinar fazer uma procedure, já fiz muitas em curso mas nunca tinha pego de verdade igual estou fazendo agora, agora entendo bem a lógica. Não precisa ser nada grande mas todo dia quero tentar entregar algo, era pra trabalhar nele todo dia massss ainda não estou 100% mas está indo, estou animado, essa semana tirei pra arrumar umas coisas em casa, estava me deixando anisioso essas coisas, tava com vazamento na pia e precisava instalar o filtro e queria fazer sozinho, vi uns vídeos e graças a Deus deu tudo certo.</w:t>
+      </w:r>
     </w:p>
     <w:p>
       <w:pPr>
@@ -2644,105 +2778,105 @@
         <w:jc w:val="both"/>
       </w:pPr>
       <w:r>
+        <w:t>from funcionarios f</w:t>
+      </w:r>
+    </w:p>
+    <w:p>
+      <w:pPr>
+        <w:ind w:firstLine="708"/>
+        <w:jc w:val="both"/>
+      </w:pPr>
+      <w:r>
+        <w:t>group by f.sexo;</w:t>
+      </w:r>
+    </w:p>
+    <w:p>
+      <w:pPr>
+        <w:ind w:firstLine="708"/>
+        <w:jc w:val="both"/>
+      </w:pPr>
+    </w:p>
+    <w:p>
+      <w:pPr>
+        <w:ind w:firstLine="708"/>
+        <w:jc w:val="both"/>
+        <w:rPr>
+          <w:b/>
+          <w:bCs/>
+        </w:rPr>
+      </w:pPr>
+      <w:r>
+        <w:rPr>
+          <w:b/>
+          <w:bCs/>
+        </w:rPr>
+        <w:t>-- Contagem de homens e mulheres</w:t>
+      </w:r>
+      <w:r>
+        <w:rPr>
+          <w:b/>
+          <w:bCs/>
+        </w:rPr>
+        <w:t xml:space="preserve"> (percentual %)</w:t>
+      </w:r>
+    </w:p>
+    <w:p>
+      <w:pPr>
+        <w:ind w:firstLine="708"/>
+        <w:jc w:val="both"/>
+      </w:pPr>
+      <w:r>
+        <w:t>select f.sexo, count(sexo) as total, concat(round(((select count(sexo) / (select count(*) from funcionarios) * 100)),2),"%") as percentual</w:t>
+      </w:r>
+    </w:p>
+    <w:p>
+      <w:pPr>
+        <w:ind w:firstLine="708"/>
+        <w:jc w:val="both"/>
+      </w:pPr>
+      <w:r>
+        <w:t>from funcionarios f</w:t>
+      </w:r>
+    </w:p>
+    <w:p>
+      <w:pPr>
+        <w:ind w:firstLine="708"/>
+        <w:jc w:val="both"/>
+      </w:pPr>
+      <w:r>
+        <w:t>group by f.sexo;</w:t>
+      </w:r>
+    </w:p>
+    <w:p>
+      <w:pPr>
+        <w:ind w:firstLine="708"/>
+        <w:jc w:val="both"/>
+      </w:pPr>
+    </w:p>
+    <w:p>
+      <w:pPr>
+        <w:ind w:firstLine="708"/>
+        <w:jc w:val="both"/>
+        <w:rPr>
+          <w:b/>
+          <w:bCs/>
+        </w:rPr>
+      </w:pPr>
+      <w:r>
+        <w:rPr>
+          <w:b/>
+          <w:bCs/>
+        </w:rPr>
+        <w:t>-- Contagem de homens e mulheres por Departamento</w:t>
+      </w:r>
+    </w:p>
+    <w:p>
+      <w:pPr>
+        <w:ind w:firstLine="708"/>
+        <w:jc w:val="both"/>
+      </w:pPr>
+      <w:r>
         <w:lastRenderedPageBreak/>
-        <w:t>from funcionarios f</w:t>
-      </w:r>
-    </w:p>
-    <w:p>
-      <w:pPr>
-        <w:ind w:firstLine="708"/>
-        <w:jc w:val="both"/>
-      </w:pPr>
-      <w:r>
-        <w:t>group by f.sexo;</w:t>
-      </w:r>
-    </w:p>
-    <w:p>
-      <w:pPr>
-        <w:ind w:firstLine="708"/>
-        <w:jc w:val="both"/>
-      </w:pPr>
-    </w:p>
-    <w:p>
-      <w:pPr>
-        <w:ind w:firstLine="708"/>
-        <w:jc w:val="both"/>
-        <w:rPr>
-          <w:b/>
-          <w:bCs/>
-        </w:rPr>
-      </w:pPr>
-      <w:r>
-        <w:rPr>
-          <w:b/>
-          <w:bCs/>
-        </w:rPr>
-        <w:t>-- Contagem de homens e mulheres</w:t>
-      </w:r>
-      <w:r>
-        <w:rPr>
-          <w:b/>
-          <w:bCs/>
-        </w:rPr>
-        <w:t xml:space="preserve"> (percentual %)</w:t>
-      </w:r>
-    </w:p>
-    <w:p>
-      <w:pPr>
-        <w:ind w:firstLine="708"/>
-        <w:jc w:val="both"/>
-      </w:pPr>
-      <w:r>
-        <w:t>select f.sexo, count(sexo) as total, concat(round(((select count(sexo) / (select count(*) from funcionarios) * 100)),2),"%") as percentual</w:t>
-      </w:r>
-    </w:p>
-    <w:p>
-      <w:pPr>
-        <w:ind w:firstLine="708"/>
-        <w:jc w:val="both"/>
-      </w:pPr>
-      <w:r>
-        <w:t>from funcionarios f</w:t>
-      </w:r>
-    </w:p>
-    <w:p>
-      <w:pPr>
-        <w:ind w:firstLine="708"/>
-        <w:jc w:val="both"/>
-      </w:pPr>
-      <w:r>
-        <w:t>group by f.sexo;</w:t>
-      </w:r>
-    </w:p>
-    <w:p>
-      <w:pPr>
-        <w:ind w:firstLine="708"/>
-        <w:jc w:val="both"/>
-      </w:pPr>
-    </w:p>
-    <w:p>
-      <w:pPr>
-        <w:ind w:firstLine="708"/>
-        <w:jc w:val="both"/>
-        <w:rPr>
-          <w:b/>
-          <w:bCs/>
-        </w:rPr>
-      </w:pPr>
-      <w:r>
-        <w:rPr>
-          <w:b/>
-          <w:bCs/>
-        </w:rPr>
-        <w:t>-- Contagem de homens e mulheres por Departamento</w:t>
-      </w:r>
-    </w:p>
-    <w:p>
-      <w:pPr>
-        <w:ind w:firstLine="708"/>
-        <w:jc w:val="both"/>
-      </w:pPr>
-      <w:r>
         <w:t>select d.nome as departamento, f.sexo, count(sexo)</w:t>
       </w:r>
     </w:p>

</xml_diff>